<commit_message>
membuat kontroler routes dan menghapus aset tidak penting
</commit_message>
<xml_diff>
--- a/Template_Laporan_Praktikum_Pemrograman_Web (3).docx
+++ b/Template_Laporan_Praktikum_Pemrograman_Web (3).docx
@@ -137,7 +137,10 @@
               <w:t>:</w:t>
             </w:r>
             <w:r>
-              <w:t xml:space="preserve"> 4</w:t>
+              <w:t xml:space="preserve"> </w:t>
+            </w:r>
+            <w:r>
+              <w:t>6</w:t>
             </w:r>
           </w:p>
         </w:tc>
@@ -187,10 +190,7 @@
               <w:t>:</w:t>
             </w:r>
             <w:r>
-              <w:t xml:space="preserve"> </w:t>
-            </w:r>
-            <w:r>
-              <w:t>Gilang</w:t>
+              <w:t xml:space="preserve"> Gilang</w:t>
             </w:r>
             <w:r>
               <w:rPr>
@@ -247,10 +247,10 @@
         <w:tblLook w:val="04A0" w:firstRow="1" w:lastRow="0" w:firstColumn="1" w:lastColumn="0" w:noHBand="0" w:noVBand="1"/>
       </w:tblPr>
       <w:tblGrid>
-        <w:gridCol w:w="410"/>
-        <w:gridCol w:w="946"/>
-        <w:gridCol w:w="6501"/>
-        <w:gridCol w:w="773"/>
+        <w:gridCol w:w="407"/>
+        <w:gridCol w:w="1063"/>
+        <w:gridCol w:w="6396"/>
+        <w:gridCol w:w="764"/>
       </w:tblGrid>
       <w:tr>
         <w:trPr>
@@ -321,7 +321,10 @@
           </w:tcPr>
           <w:p>
             <w:r>
-              <w:t>Membuat ui dashboard</w:t>
+              <w:t xml:space="preserve">Menerapkan </w:t>
+            </w:r>
+            <w:r>
+              <w:t>Blade Templating Engine</w:t>
             </w:r>
           </w:p>
         </w:tc>
@@ -335,10 +338,10 @@
                 <w:noProof/>
               </w:rPr>
               <w:drawing>
-                <wp:inline distT="0" distB="0" distL="0" distR="0" wp14:anchorId="1A605C75" wp14:editId="7DC7B5EA">
+                <wp:inline distT="0" distB="0" distL="0" distR="0" wp14:anchorId="74FF8754" wp14:editId="09F79642">
                   <wp:extent cx="5486400" cy="3086100"/>
                   <wp:effectExtent l="0" t="0" r="0" b="0"/>
-                  <wp:docPr id="814307467" name="Gambar 1"/>
+                  <wp:docPr id="1939665001" name="Gambar 1"/>
                   <wp:cNvGraphicFramePr>
                     <a:graphicFrameLocks xmlns:a="http://schemas.openxmlformats.org/drawingml/2006/main" noChangeAspect="1"/>
                   </wp:cNvGraphicFramePr>
@@ -346,7 +349,7 @@
                     <a:graphicData uri="http://schemas.openxmlformats.org/drawingml/2006/picture">
                       <pic:pic xmlns:pic="http://schemas.openxmlformats.org/drawingml/2006/picture">
                         <pic:nvPicPr>
-                          <pic:cNvPr id="814307467" name=""/>
+                          <pic:cNvPr id="1939665001" name=""/>
                           <pic:cNvPicPr/>
                         </pic:nvPicPr>
                         <pic:blipFill>
@@ -400,7 +403,10 @@
           </w:tcPr>
           <w:p>
             <w:r>
-              <w:t>Membuat routes dashboard</w:t>
+              <w:t xml:space="preserve">Menerapkan </w:t>
+            </w:r>
+            <w:r>
+              <w:t>Blade Templating Engine</w:t>
             </w:r>
           </w:p>
         </w:tc>
@@ -414,10 +420,10 @@
                 <w:noProof/>
               </w:rPr>
               <w:drawing>
-                <wp:inline distT="0" distB="0" distL="0" distR="0" wp14:anchorId="12910B6A" wp14:editId="616F9B5A">
+                <wp:inline distT="0" distB="0" distL="0" distR="0" wp14:anchorId="0614CBB4" wp14:editId="66D77D8C">
                   <wp:extent cx="5486400" cy="3086100"/>
                   <wp:effectExtent l="0" t="0" r="0" b="0"/>
-                  <wp:docPr id="424937600" name="Gambar 1"/>
+                  <wp:docPr id="506696381" name="Gambar 1"/>
                   <wp:cNvGraphicFramePr>
                     <a:graphicFrameLocks xmlns:a="http://schemas.openxmlformats.org/drawingml/2006/main" noChangeAspect="1"/>
                   </wp:cNvGraphicFramePr>
@@ -425,7 +431,7 @@
                     <a:graphicData uri="http://schemas.openxmlformats.org/drawingml/2006/picture">
                       <pic:pic xmlns:pic="http://schemas.openxmlformats.org/drawingml/2006/picture">
                         <pic:nvPicPr>
-                          <pic:cNvPr id="424937600" name=""/>
+                          <pic:cNvPr id="506696381" name=""/>
                           <pic:cNvPicPr/>
                         </pic:nvPicPr>
                         <pic:blipFill>
@@ -478,7 +484,10 @@
           </w:tcPr>
           <w:p>
             <w:r>
-              <w:t>Membuat controller dashboard</w:t>
+              <w:t xml:space="preserve">Menerapkan </w:t>
+            </w:r>
+            <w:r>
+              <w:t>Blade Templating Engine</w:t>
             </w:r>
           </w:p>
         </w:tc>
@@ -492,10 +501,10 @@
                 <w:noProof/>
               </w:rPr>
               <w:drawing>
-                <wp:inline distT="0" distB="0" distL="0" distR="0" wp14:anchorId="706295D7" wp14:editId="111B4C0C">
+                <wp:inline distT="0" distB="0" distL="0" distR="0" wp14:anchorId="271B995A" wp14:editId="68D6E6D0">
                   <wp:extent cx="5486400" cy="3086100"/>
                   <wp:effectExtent l="0" t="0" r="0" b="0"/>
-                  <wp:docPr id="2017489475" name="Gambar 1"/>
+                  <wp:docPr id="377435274" name="Gambar 1"/>
                   <wp:cNvGraphicFramePr>
                     <a:graphicFrameLocks xmlns:a="http://schemas.openxmlformats.org/drawingml/2006/main" noChangeAspect="1"/>
                   </wp:cNvGraphicFramePr>
@@ -503,7 +512,7 @@
                     <a:graphicData uri="http://schemas.openxmlformats.org/drawingml/2006/picture">
                       <pic:pic xmlns:pic="http://schemas.openxmlformats.org/drawingml/2006/picture">
                         <pic:nvPicPr>
-                          <pic:cNvPr id="2017489475" name=""/>
+                          <pic:cNvPr id="377435274" name=""/>
                           <pic:cNvPicPr/>
                         </pic:nvPicPr>
                         <pic:blipFill>
@@ -546,7 +555,6 @@
           </w:tcPr>
           <w:p>
             <w:r>
-              <w:lastRenderedPageBreak/>
               <w:t>4</w:t>
             </w:r>
           </w:p>
@@ -555,61 +563,13 @@
           <w:tcPr>
             <w:tcW w:w="841" w:type="dxa"/>
           </w:tcPr>
-          <w:p>
-            <w:r>
-              <w:t>Hasil ui dari dashboard (baru s</w:t>
-            </w:r>
-            <w:r>
-              <w:t>s tanggal 15 jdi nya udh banyak ke ubah)</w:t>
-            </w:r>
-          </w:p>
+          <w:p/>
         </w:tc>
         <w:tc>
           <w:tcPr>
             <w:tcW w:w="6594" w:type="dxa"/>
           </w:tcPr>
-          <w:p>
-            <w:r>
-              <w:rPr>
-                <w:noProof/>
-              </w:rPr>
-              <w:drawing>
-                <wp:inline distT="0" distB="0" distL="0" distR="0" wp14:anchorId="7345186E" wp14:editId="3CC728A0">
-                  <wp:extent cx="5486400" cy="3086100"/>
-                  <wp:effectExtent l="0" t="0" r="0" b="0"/>
-                  <wp:docPr id="1075785779" name="Gambar 1"/>
-                  <wp:cNvGraphicFramePr>
-                    <a:graphicFrameLocks xmlns:a="http://schemas.openxmlformats.org/drawingml/2006/main" noChangeAspect="1"/>
-                  </wp:cNvGraphicFramePr>
-                  <a:graphic xmlns:a="http://schemas.openxmlformats.org/drawingml/2006/main">
-                    <a:graphicData uri="http://schemas.openxmlformats.org/drawingml/2006/picture">
-                      <pic:pic xmlns:pic="http://schemas.openxmlformats.org/drawingml/2006/picture">
-                        <pic:nvPicPr>
-                          <pic:cNvPr id="1075785779" name=""/>
-                          <pic:cNvPicPr/>
-                        </pic:nvPicPr>
-                        <pic:blipFill>
-                          <a:blip r:embed="rId11"/>
-                          <a:stretch>
-                            <a:fillRect/>
-                          </a:stretch>
-                        </pic:blipFill>
-                        <pic:spPr>
-                          <a:xfrm>
-                            <a:off x="0" y="0"/>
-                            <a:ext cx="5486400" cy="3086100"/>
-                          </a:xfrm>
-                          <a:prstGeom prst="rect">
-                            <a:avLst/>
-                          </a:prstGeom>
-                        </pic:spPr>
-                      </pic:pic>
-                    </a:graphicData>
-                  </a:graphic>
-                </wp:inline>
-              </w:drawing>
-            </w:r>
-          </w:p>
+          <w:p/>
         </w:tc>
         <w:tc>
           <w:tcPr>
@@ -665,7 +625,7 @@
       </w:r>
     </w:p>
     <w:p>
-      <w:hyperlink r:id="rId12" w:history="1">
+      <w:hyperlink r:id="rId11" w:history="1">
         <w:r>
           <w:rPr>
             <w:rStyle w:val="Hyperlink"/>
@@ -675,8 +635,8 @@
       </w:hyperlink>
     </w:p>
     <w:sectPr>
-      <w:headerReference w:type="default" r:id="rId13"/>
-      <w:footerReference w:type="default" r:id="rId14"/>
+      <w:headerReference w:type="default" r:id="rId12"/>
+      <w:footerReference w:type="default" r:id="rId13"/>
       <w:pgSz w:w="12240" w:h="15840"/>
       <w:pgMar w:top="1440" w:right="1800" w:bottom="1440" w:left="1800" w:header="720" w:footer="720" w:gutter="0"/>
       <w:cols w:space="720"/>

</xml_diff>